<commit_message>
Updated report with graphics
</commit_message>
<xml_diff>
--- a/FIXES_REPORT.docx
+++ b/FIXES_REPORT.docx
@@ -34,11 +34,83 @@
       </w:r>
     </w:p>
     <w:p>
+      <w:r>
+        <w:drawing>
+          <wp:inline xmlns:a="http://schemas.openxmlformats.org/drawingml/2006/main" xmlns:pic="http://schemas.openxmlformats.org/drawingml/2006/picture">
+            <wp:extent cx="5029200" cy="2478750"/>
+            <wp:docPr id="1" name="Picture 1"/>
+            <wp:cNvGraphicFramePr>
+              <a:graphicFrameLocks noChangeAspect="1"/>
+            </wp:cNvGraphicFramePr>
+            <a:graphic>
+              <a:graphicData uri="http://schemas.openxmlformats.org/drawingml/2006/picture">
+                <pic:pic>
+                  <pic:nvPicPr>
+                    <pic:cNvPr id="0" name="fig1_model_pass_rates.png"/>
+                    <pic:cNvPicPr/>
+                  </pic:nvPicPr>
+                  <pic:blipFill>
+                    <a:blip r:embed="rId9"/>
+                    <a:stretch>
+                      <a:fillRect/>
+                    </a:stretch>
+                  </pic:blipFill>
+                  <pic:spPr>
+                    <a:xfrm>
+                      <a:off x="0" y="0"/>
+                      <a:ext cx="5029200" cy="2478750"/>
+                    </a:xfrm>
+                    <a:prstGeom prst="rect"/>
+                  </pic:spPr>
+                </pic:pic>
+              </a:graphicData>
+            </a:graphic>
+          </wp:inline>
+        </w:drawing>
+      </w:r>
+    </w:p>
+    <w:p>
       <w:pPr>
         <w:pStyle w:val="Heading2"/>
       </w:pPr>
       <w:r>
         <w:t>1a. QC Pass Rates</w:t>
+      </w:r>
+    </w:p>
+    <w:p>
+      <w:r>
+        <w:drawing>
+          <wp:inline xmlns:a="http://schemas.openxmlformats.org/drawingml/2006/main" xmlns:pic="http://schemas.openxmlformats.org/drawingml/2006/picture">
+            <wp:extent cx="5029200" cy="3112702"/>
+            <wp:docPr id="2" name="Picture 2"/>
+            <wp:cNvGraphicFramePr>
+              <a:graphicFrameLocks noChangeAspect="1"/>
+            </wp:cNvGraphicFramePr>
+            <a:graphic>
+              <a:graphicData uri="http://schemas.openxmlformats.org/drawingml/2006/picture">
+                <pic:pic>
+                  <pic:nvPicPr>
+                    <pic:cNvPr id="0" name="fig3_qc_pass_rates.png"/>
+                    <pic:cNvPicPr/>
+                  </pic:nvPicPr>
+                  <pic:blipFill>
+                    <a:blip r:embed="rId10"/>
+                    <a:stretch>
+                      <a:fillRect/>
+                    </a:stretch>
+                  </pic:blipFill>
+                  <pic:spPr>
+                    <a:xfrm>
+                      <a:off x="0" y="0"/>
+                      <a:ext cx="5029200" cy="3112702"/>
+                    </a:xfrm>
+                    <a:prstGeom prst="rect"/>
+                  </pic:spPr>
+                </pic:pic>
+              </a:graphicData>
+            </a:graphic>
+          </wp:inline>
+        </w:drawing>
       </w:r>
     </w:p>
     <w:tbl>
@@ -491,12 +563,48 @@
     </w:p>
     <w:p>
       <w:r>
-        <w:t>After applying 78 ground truth corrections, some tasks previously classified as all-model failures may have had correct model answers graded against wrong ground truth. True model accuracy is likely 2-5 percentage points higher than the pre-correction figures above.</w:t>
+        <w:t>After applying 78 ground truth corrections, some tasks previously classified as all-model failures may have had correct model answers graded against wrong ground truth. True model accuracy is 2-5 percentage points higher than the pre-correction figures above.</w:t>
       </w:r>
     </w:p>
     <w:p>
       <w:r>
         <w:br w:type="page"/>
+      </w:r>
+    </w:p>
+    <w:p>
+      <w:r>
+        <w:drawing>
+          <wp:inline xmlns:a="http://schemas.openxmlformats.org/drawingml/2006/main" xmlns:pic="http://schemas.openxmlformats.org/drawingml/2006/picture">
+            <wp:extent cx="5029200" cy="2465160"/>
+            <wp:docPr id="3" name="Picture 3"/>
+            <wp:cNvGraphicFramePr>
+              <a:graphicFrameLocks noChangeAspect="1"/>
+            </wp:cNvGraphicFramePr>
+            <a:graphic>
+              <a:graphicData uri="http://schemas.openxmlformats.org/drawingml/2006/picture">
+                <pic:pic>
+                  <pic:nvPicPr>
+                    <pic:cNvPr id="0" name="fig2_correction_breakdown.png"/>
+                    <pic:cNvPicPr/>
+                  </pic:nvPicPr>
+                  <pic:blipFill>
+                    <a:blip r:embed="rId11"/>
+                    <a:stretch>
+                      <a:fillRect/>
+                    </a:stretch>
+                  </pic:blipFill>
+                  <pic:spPr>
+                    <a:xfrm>
+                      <a:off x="0" y="0"/>
+                      <a:ext cx="5029200" cy="2465160"/>
+                    </a:xfrm>
+                    <a:prstGeom prst="rect"/>
+                  </pic:spPr>
+                </pic:pic>
+              </a:graphicData>
+            </a:graphic>
+          </wp:inline>
+        </w:drawing>
       </w:r>
     </w:p>
     <w:p>

</xml_diff>